<commit_message>
added rule-flagged indicator tracing
</commit_message>
<xml_diff>
--- a/AML Knowledge Library/AML_Knowledge_Library_Documentation_v2.docx
+++ b/AML Knowledge Library/AML_Knowledge_Library_Documentation_v2.docx
@@ -588,7 +588,7 @@
         <w:rPr>
           <w:color w:val="111111"/>
         </w:rPr>
-        <w:t>To ensure a feasible scope, only indicators applicable to the specific datasets provided were collected within the typologies. The library however also includes a foundation of general ML/TF indicators (drawn from FINTRAC's General Indicators guidance) that underpin all typologies and support broad-spectrum model development; these indicators are non-specific to the data.</w:t>
+        <w:t>To ensure a feasible scope, only indicators applicable to the specific datasets provided were collected within the typologies. The library however also includes a foundation of general ML indicators (drawn from FINTRAC's General Indicators guidance) that underpin all typologies and support broad-spectrum model development; these indicators are non-specific to the data.</w:t>
       </w:r>
     </w:p>
     <w:p>
@@ -12472,7 +12472,7 @@
                 <w:sz w:val="19"/>
                 <w:szCs w:val="19"/>
               </w:rPr>
-              <w:t>An observable financial behavior or pattern associated with elevated ML/TF risk.</w:t>
+              <w:t>An observable financial behavior or pattern associated with elevated ML risk.</w:t>
             </w:r>
           </w:p>
         </w:tc>
@@ -12712,7 +12712,7 @@
                 <w:sz w:val="19"/>
                 <w:szCs w:val="19"/>
               </w:rPr>
-              <w:t>A documented pattern or method used by criminals to commit ML/TF; forms the basis for indicator design.</w:t>
+              <w:t>A documented pattern or method used by criminals to commit ML; forms the basis for indicator design.</w:t>
             </w:r>
           </w:p>
         </w:tc>

</xml_diff>

<commit_message>
updated KLs and ref docs
</commit_message>
<xml_diff>
--- a/AML Knowledge Library/AML_Knowledge_Library_Documentation_v2.docx
+++ b/AML Knowledge Library/AML_Knowledge_Library_Documentation_v2.docx
@@ -426,6 +426,12 @@
         </w:rPr>
         <w:t>The AML Knowledge Library is a structured, queryable repository of anti-money laundering (AML) red flag indicators and typologies. It is designed to serve as a dual-purpose resource supporting both quantitative model development and broadly, qualitative investigative analysis.</w:t>
       </w:r>
+      <w:r>
+        <w:rPr>
+          <w:color w:val="111111"/>
+        </w:rPr>
+        <w:t xml:space="preserve"> </w:t>
+      </w:r>
     </w:p>
     <w:p>
       <w:pPr>
@@ -2425,6 +2431,66 @@
         </w:rPr>
         <w:t xml:space="preserve"> have been removed from the final version of the knowledge library due to specificity and complexity; users must add and determine these fields independently as they depend primarily on the data provided.</w:t>
       </w:r>
+      <w:r>
+        <w:rPr>
+          <w:color w:val="111111"/>
+        </w:rPr>
+        <w:t xml:space="preserve"> </w:t>
+      </w:r>
+    </w:p>
+    <w:p>
+      <w:pPr>
+        <w:spacing w:before="80" w:after="80"/>
+        <w:rPr>
+          <w:color w:val="111111"/>
+        </w:rPr>
+      </w:pPr>
+    </w:p>
+    <w:p>
+      <w:pPr>
+        <w:spacing w:before="80" w:after="80"/>
+        <w:rPr>
+          <w:b/>
+          <w:bCs/>
+          <w:color w:val="111111"/>
+        </w:rPr>
+      </w:pPr>
+      <w:r>
+        <w:rPr>
+          <w:b/>
+          <w:bCs/>
+          <w:color w:val="111111"/>
+        </w:rPr>
+        <w:t>NOTE: For the subset of indicators that have been implemented in the AML detection pipeline concerned by this Knowledge Library, please see ‘</w:t>
+      </w:r>
+      <w:r>
+        <w:rPr>
+          <w:b/>
+          <w:bCs/>
+          <w:i/>
+          <w:iCs/>
+          <w:color w:val="111111"/>
+        </w:rPr>
+        <w:t>AML-indicator-KL.xlsx</w:t>
+      </w:r>
+      <w:r>
+        <w:rPr>
+          <w:b/>
+          <w:bCs/>
+          <w:i/>
+          <w:iCs/>
+          <w:color w:val="111111"/>
+        </w:rPr>
+        <w:t>’</w:t>
+      </w:r>
+      <w:r>
+        <w:rPr>
+          <w:b/>
+          <w:bCs/>
+          <w:color w:val="111111"/>
+        </w:rPr>
+        <w:t xml:space="preserve"> in the attached reference documents of the project.</w:t>
+      </w:r>
     </w:p>
     <w:p>
       <w:pPr>
@@ -3144,6 +3210,7 @@
         <w:pStyle w:val="Heading2"/>
       </w:pPr>
       <w:r>
+        <w:lastRenderedPageBreak/>
         <w:t>2.2  AML Investigators</w:t>
       </w:r>
     </w:p>
@@ -3173,7 +3240,6 @@
         <w:pStyle w:val="Heading3"/>
       </w:pPr>
       <w:r>
-        <w:lastRenderedPageBreak/>
         <w:t>Key Fields for Investigation</w:t>
       </w:r>
     </w:p>
@@ -4064,6 +4130,7 @@
           <w:bCs/>
           <w:color w:val="111111"/>
         </w:rPr>
+        <w:lastRenderedPageBreak/>
         <w:t>Red_Flag_Description</w:t>
       </w:r>
       <w:r>

</xml_diff>